<commit_message>
docs(defense): rewrite speaking notes for natural delivery
</commit_message>
<xml_diff>
--- a/bao-ve/LOI-THUYET-TRINH-15-PHUT.docx
+++ b/bao-ve/LOI-THUYET-TRINH-15-PHUT.docx
@@ -15,7 +15,7 @@
         <w:spacing w:after="240"/>
       </w:pPr>
       <w:r>
-        <w:t>Đọc như đang giải thích công việc mình làm, không đọc nguyên bảng số. Các mốc thời gian là phân bổ dự kiến có tính lúc chuyển slide và dừng ngắn; cần đọc thử, bấm giờ trước buổi bảo vệ. Các câu in đậm là chỗ cần nhấn giọng, không phải để đọc to hơn.</w:t>
+        <w:t>Bản luyện nói theo 10 slide. Mốc thời gian dùng để tập thử; khi luyện nên bấm giờ và nghỉ ngắn ở chỗ xuống đoạn. Chữ in đậm là ý cần nhấn.</w:t>
       </w:r>
     </w:p>
     <w:p>
@@ -36,7 +36,7 @@
           <w:b/>
           <w:sz w:val="22"/>
         </w:rPr>
-        <w:t>Mốc thời gian: 0:00–0:40</w:t>
+        <w:t>Mốc thời gian: 0:00–0:45</w:t>
       </w:r>
     </w:p>
     <w:p>
@@ -45,7 +45,7 @@
         <w:rPr>
           <w:b w:val="0"/>
         </w:rPr>
-        <w:t>Kính thưa cô và các thầy cô, em là Đoàn Ngọc Hoàng Minh. Chuyên đề của em nghiên cứu cách tạo đặc trưng từ log để phục vụ phát hiện tấn công. Vấn đề em theo đuổi không chỉ là đổi log thành vector. Em muốn biết khi gom nhiều sự kiện vào một vector thì thông tin an ninh nào còn lại, thông tin nào mất đi, và mình có cách nào kiểm tra điều đó mà không tự đánh lừa bằng một điểm số đẹp. Em xin đi từ câu hỏi ấy đến phương pháp, rồi trình bày kết quả thực nghiệm, kể cả kết quả chưa ủng hộ giả thuyết ban đầu.</w:t>
+        <w:t>Kính thưa cô và các thầy cô, em là Đoàn Ngọc Hoàng Minh. Hôm nay em xin trình bày chuyên đề về cách tạo đặc trưng từ log để phục vụ phát hiện tấn công. Thoạt nhìn, việc này giống như chuyển các dòng log thành vector. Nhưng điều em thực sự muốn hỏi là: sau khi gộp nhiều sự kiện vào một vector, những thông tin có ích cho an ninh còn giữ được đến đâu? Và mình kiểm tra việc ấy bằng cách nào, thay vì chỉ thấy điểm đánh giá cao rồi cho rằng mô hình đã học đúng? Em sẽ đi từ câu hỏi đó đến cách làm, sau đó nói thẳng về kết quả thực nghiệm, kể cả chỗ kết quả không đúng với dự kiến ban đầu.</w:t>
       </w:r>
     </w:p>
     <w:p>
@@ -71,7 +71,7 @@
           <w:b/>
           <w:sz w:val="22"/>
         </w:rPr>
-        <w:t>Mốc thời gian: 0:40–2:05</w:t>
+        <w:t>Mốc thời gian: 0:45–2:15</w:t>
       </w:r>
     </w:p>
     <w:p>
@@ -80,7 +80,7 @@
         <w:rPr>
           <w:b w:val="0"/>
         </w:rPr>
-        <w:t>Một dòng log thường kể được rất ít. Nó cho biết một sự kiện đã xảy ra, nhưng ý nghĩa an ninh của sự kiện ấy còn phụ thuộc vào cái gì xảy ra trước đó, thực thể nào liên quan và tham số cụ thể là gì. Vì vậy, nếu chỉ đếm mẫu hoặc tần suất, ta dễ bỏ sót quan hệ và tham số. Nếu chỉ đọc chuỗi, ta giữ được diễn biến nhưng chưa chắc nhìn rõ các phụ thuộc giữa nhiều thực thể. Nếu dựng đồ thị, quan hệ hiện ra rõ hơn, đổi lại chi phí xử lý tăng lên.</w:t>
+        <w:t>Trước hết, vì sao phải nghĩ lại cách biểu diễn log? Một dòng log đứng riêng thường chưa nói được nhiều. Cùng một sự kiện, nhưng xảy ra sau chuỗi nào, gắn với thực thể nào, mang tham số gì, thì ý nghĩa an ninh có thể khác. Nếu chỉ đếm mẫu log, ta thấy tần suất nhưng dễ mất các quan hệ ấy. Nếu đọc theo chuỗi, ta giữ được diễn biến, còn mối phụ thuộc giữa nhiều thực thể thì chưa chắc đã rõ. Đồ thị có thể giúp nhìn quan hệ, nhưng lại tốn thêm chi phí xử lý. Thành ra, chọn cách biểu diễn nào cũng là chọn thứ mình giữ và thứ mình có thể bỏ sót.</w:t>
       </w:r>
     </w:p>
     <w:p>
@@ -89,7 +89,7 @@
         <w:rPr>
           <w:b w:val="0"/>
         </w:rPr>
-        <w:t>Từ khảo sát ở Chương 1, em rút ra năm khoảng trống. Trên slide em đã đặt chúng ở phía bên phải; trong 15 phút này em tập trung vào ba khoảng trống chi phối cách làm: giữ ngữ nghĩa tham số, kết hợp chuỗi với đồ thị mà không làm hỏng biểu diễn tốt sẵn có, và kiểm soát rò rỉ khi đánh giá. Hai khoảng trống còn lại — nhãn an ninh mức thô và quyền riêng tư — được đưa vào khung thiết kế nhưng chưa có thực nghiệm đầy đủ.</w:t>
+        <w:t>Từ phần khảo sát ở Chương 1, em rút ra năm khoảng trống. Trên slide có đủ cả năm; ở đây em xin tập trung vào ba việc dẫn trực tiếp đến thiết kế thực nghiệm: giữ ngữ nghĩa tham số, thử kết hợp chuỗi với đồ thị mà không làm hỏng phần biểu diễn đã tốt, và ngăn rò rỉ dữ liệu khi đánh giá. Hai việc còn lại là nhãn an ninh ở mức thô và quyền riêng tư. Chúng có mặt trong khung thiết kế, nhưng chuyên đề này chưa có thực nghiệm đầy đủ để kết luận về chúng.</w:t>
       </w:r>
     </w:p>
     <w:p>
@@ -98,13 +98,13 @@
         <w:rPr>
           <w:b/>
         </w:rPr>
-        <w:t>Một mô hình phức tạp hơn không mặc nhiên học được tín hiệu an ninh tốt hơn.</w:t>
+        <w:t>Ý chính của slide này là: thêm một mô hình phức tạp chưa chắc đã tốt hơn.</w:t>
       </w:r>
       <w:r>
         <w:rPr>
           <w:b w:val="0"/>
         </w:rPr>
-        <w:t xml:space="preserve"> Muốn nói nó tốt hơn, trước hết phải chỉ rõ tín hiệu cần giữ là gì, rồi đo dưới cùng một cách chia dữ liệu và cùng một giao thức.</w:t>
+        <w:t xml:space="preserve"> Trước khi so điểm, mình phải nói rõ muốn vector giữ thông tin gì, rồi đặt các mô hình vào cùng một cách chia dữ liệu và một cách đo.</w:t>
       </w:r>
     </w:p>
     <w:p>
@@ -130,7 +130,7 @@
           <w:b/>
           <w:sz w:val="22"/>
         </w:rPr>
-        <w:t>Mốc thời gian: 2:05–3:25</w:t>
+        <w:t>Mốc thời gian: 2:15–4:00</w:t>
       </w:r>
     </w:p>
     <w:p>
@@ -139,7 +139,43 @@
         <w:rPr>
           <w:b w:val="0"/>
         </w:rPr>
-        <w:t>Em gọi bộ tiêu chí đó là Hợp đồng Biểu diễn. Nó có ba nhóm điều kiện. Bảo toàn là giữ những thứ có thể mang ý nghĩa an ninh, như tham số lệnh, thứ tự thời gian và quan hệ phụ thuộc. Bất biến là không để những thay đổi vô hại — chẳng hạn một PID ngẫu nhiên hoặc cách ghi thời gian — làm đổi kết luận một cách vô lý. Triệt tiêu là hạn chế dấu vết rò rỉ, dấu vết môi trường thí nghiệm và định danh nhạy cảm mà mô hình có thể lợi dụng để học đường tắt.</w:t>
+        <w:t xml:space="preserve">Từ câu hỏi vừa rồi, em đặt ra Hợp đồng Biểu diễn. Có thể hiểu đây là bộ tiêu chí để hỏi một vector log cần làm được gì. Nhóm thứ nhất là </w:t>
+      </w:r>
+      <w:r>
+        <w:rPr>
+          <w:b/>
+        </w:rPr>
+        <w:t>bảo toàn</w:t>
+      </w:r>
+      <w:r>
+        <w:rPr>
+          <w:b w:val="0"/>
+        </w:rPr>
+        <w:t xml:space="preserve">: giữ những dấu hiệu có thể mang ý nghĩa an ninh, như tham số lệnh, thứ tự thời gian và quan hệ phụ thuộc. Nhóm thứ hai là </w:t>
+      </w:r>
+      <w:r>
+        <w:rPr>
+          <w:b/>
+        </w:rPr>
+        <w:t>bất biến</w:t>
+      </w:r>
+      <w:r>
+        <w:rPr>
+          <w:b w:val="0"/>
+        </w:rPr>
+        <w:t xml:space="preserve">: nếu một chi tiết vô hại thay đổi, chẳng hạn PID ngẫu nhiên hoặc cách ghi thời gian, thì kết luận không nên thay đổi một cách vô lý. Nhóm cuối là </w:t>
+      </w:r>
+      <w:r>
+        <w:rPr>
+          <w:b/>
+        </w:rPr>
+        <w:t>triệt tiêu</w:t>
+      </w:r>
+      <w:r>
+        <w:rPr>
+          <w:b w:val="0"/>
+        </w:rPr>
+        <w:t>: hạn chế dấu vết rò rỉ, dấu vết riêng của môi trường thí nghiệm và định danh nhạy cảm mà mô hình có thể bám vào để học đường tắt.</w:t>
       </w:r>
     </w:p>
     <w:p>
@@ -148,19 +184,19 @@
         <w:rPr>
           <w:b w:val="0"/>
         </w:rPr>
-        <w:t xml:space="preserve">Ba từ này dễ nghe như cam kết rằng mô hình đã đạt cả ba. Em không dùng chúng theo nghĩa đó. Đây là </w:t>
+        <w:t xml:space="preserve">Đến đây em muốn nói rõ một điểm. Ba nhóm ấy là </w:t>
       </w:r>
       <w:r>
         <w:rPr>
           <w:b/>
         </w:rPr>
-        <w:t>đặc tả những gì cần kiểm tra</w:t>
+        <w:t>điều kiện cần đem ra kiểm tra</w:t>
       </w:r>
       <w:r>
         <w:rPr>
           <w:b w:val="0"/>
         </w:rPr>
-        <w:t>. Một phép kiểm tra có thể thất bại, và thất bại ấy vẫn cho ta thông tin. Ví dụ, muốn nói vector giữ tham số, phải có phép đo phù hợp với tham số; chỉ nhìn AP phát hiện bất thường ở cấp phiên thì chưa đủ.</w:t>
+        <w:t>, chứ không phải lời khẳng định rằng mô hình của em đã đạt cả ba. Chẳng hạn, muốn nói vector giữ được ý nghĩa của tham số, mình phải đo đúng ở cấp tham số. Một điểm AP phát hiện bất thường ở cấp phiên, dù cao, cũng chưa trả lời được câu hỏi đó.</w:t>
       </w:r>
     </w:p>
     <w:p>
@@ -169,7 +205,7 @@
         <w:rPr>
           <w:b w:val="0"/>
         </w:rPr>
-        <w:t>Vì thế, em tách bộ trích xuất khỏi bộ phát hiện. Bộ trích xuất học vector từ log; khi đánh giá thì khóa trọng số của nó, huấn luyện riêng một đầu dò tuyến tính. Cách này đo được thông tin có thể đọc ra bằng một bộ phân loại tuyến tính, chứ không tuyên bố đã khai thác hết mọi thông tin phi tuyến trong vector.</w:t>
+        <w:t>Vì vậy, khi đánh giá, em tách bộ tạo vector ra khỏi bộ phân loại. Em đóng băng trọng số bộ tạo vector, rồi chỉ huấn luyện một đầu dò tuyến tính trên các vector đã có. Nếu đầu dò làm tốt, ta biết thông tin hữu ích có thể đọc ra theo cách tuyến tính. Còn những thông tin phi tuyến khác có hay không, phép đo này tự nó chưa kết luận được. Cách tách ấy cũng giúp em nói đúng phạm vi của mỗi kết quả ở các slide sau.</w:t>
       </w:r>
     </w:p>
     <w:p>
@@ -195,7 +231,7 @@
           <w:b/>
           <w:sz w:val="22"/>
         </w:rPr>
-        <w:t>Mốc thời gian: 3:25–5:00</w:t>
+        <w:t>Mốc thời gian: 4:00–5:30</w:t>
       </w:r>
     </w:p>
     <w:p>
@@ -204,7 +240,7 @@
         <w:rPr>
           <w:b w:val="0"/>
         </w:rPr>
-        <w:t>Kiến trúc em đề xuất có hai nhánh. Nhánh chuỗi dùng Transformer để giữ thứ tự và ngữ cảnh sự kiện. Nhánh đồ thị dùng Temporal GNN để biểu diễn các quan hệ thực thể biến đổi theo thời gian. Sau đó, hai nhánh được gióng hàng trong không gian chiếu và kết hợp thành vector cho đánh giá hạ nguồn. Trong thiết kế, đầu chiếu và các hàm mất mát phục vụ huấn luyện không phải là toàn bộ chi phí suy luận khi triển khai.</w:t>
+        <w:t>Vậy em thử tạo vector bằng cách nào? Kiến trúc có hai nhánh. Nhánh chuỗi dùng Transformer để đọc thứ tự và ngữ cảnh của sự kiện. Nhánh đồ thị dùng Temporal GNN để biểu diễn quan hệ giữa các thực thể theo thời gian. Sau đó, hai nhánh được gióng hàng trong không gian chiếu và kết hợp thành một vector để đánh giá ở bài toán hạ nguồn. Ở đây cũng cần phân biệt: đầu chiếu và các hàm mất mát là phần dùng khi huấn luyện; chi phí suy luận khi triển khai phải được tính theo đường chạy thực tế, chứ không bê nguyên sơ đồ huấn luyện sang.</w:t>
       </w:r>
     </w:p>
     <w:p>
@@ -213,19 +249,19 @@
         <w:rPr>
           <w:b w:val="0"/>
         </w:rPr>
-        <w:t xml:space="preserve">Lý do ghép hai nhánh là hợp lý về mặt bài toán: chuỗi thấy diễn biến, đồ thị thấy phụ thuộc. Nhưng có một giả định cần kiểm tra: </w:t>
+        <w:t xml:space="preserve">Lý do ghép hai nhánh khá dễ hiểu: chuỗi cho ta diễn biến, còn đồ thị cho ta quan hệ. Nhưng “có lý về mặt thiết kế” chưa có nghĩa là chắc chắn hiệu quả. </w:t>
       </w:r>
       <w:r>
         <w:rPr>
           <w:b/>
         </w:rPr>
-        <w:t>hai nguồn thông tin có thực sự bổ sung cho nhau trên dữ liệu đang xét không?</w:t>
+        <w:t>Câu hỏi thực nghiệm là: trên dữ liệu này, hai nguồn thông tin có bổ sung cho nhau thật không?</w:t>
       </w:r>
       <w:r>
         <w:rPr>
           <w:b w:val="0"/>
         </w:rPr>
-        <w:t xml:space="preserve"> Nếu nhánh đồ thị nhiễu, hoặc bước gióng hàng ép hai biểu diễn khác bản chất thành quá giống nhau, kết quả có thể giảm. Em không coi sơ đồ kiến trúc là bằng chứng rằng Multi-View sẽ thắng.</w:t>
+        <w:t xml:space="preserve"> Nếu quan hệ đồ thị chứa nhiều nhiễu, hoặc bước gióng hàng làm mất những khác biệt vốn có ích, Multi-View có thể còn kém đi. Vì thế, em đưa nó vào phép so sánh, chứ không mặc định nó sẽ thắng.</w:t>
       </w:r>
     </w:p>
     <w:p>
@@ -234,7 +270,7 @@
         <w:rPr>
           <w:b w:val="0"/>
         </w:rPr>
-        <w:t>Phần suy luận theo dòng ở cuối slide là hướng thiết kế: sự kiện mới đến, trạng thái hữu hạn được cập nhật, rồi tạo vector hiện tại. Trong thực nghiệm HDFS hiện nay em chưa đo toàn trình thông lượng hay độ trễ. Do đó, em chỉ bảo vệ đây là cấu trúc dự kiến cho vận hành, chưa bảo vệ được yêu cầu thời gian thực.</w:t>
+        <w:t>Ở cuối slide là hướng suy luận theo dòng: sự kiện mới đi vào, trạng thái hữu hạn được cập nhật, rồi tạo vector tại thời điểm đó. Phần này mới là thiết kế. Với HDFS, em chưa đo toàn trình thông lượng và độ trễ, nên chưa thể nói hệ thống đã đáp ứng yêu cầu thời gian thực.</w:t>
       </w:r>
     </w:p>
     <w:p>
@@ -260,7 +296,7 @@
           <w:b/>
           <w:sz w:val="22"/>
         </w:rPr>
-        <w:t>Mốc thời gian: 5:00–6:15</w:t>
+        <w:t>Mốc thời gian: 5:30–6:50</w:t>
       </w:r>
     </w:p>
     <w:p>
@@ -269,19 +305,19 @@
         <w:rPr>
           <w:b w:val="0"/>
         </w:rPr>
-        <w:t xml:space="preserve">Dữ liệu HDFS có hơn 11 triệu bản ghi log, gắn với hơn 575 nghìn phiên khối. Chiến dịch này dùng 35 nghìn phiên Train và 7 nghìn 500 phiên Validation, với cửa sổ ngữ cảnh dài 256 sự kiện. Điểm cần chú ý không chỉ là quy mô, mà là </w:t>
+        <w:t xml:space="preserve">Trước khi xem mô hình học được gì, phải chắc rằng cách chia dữ liệu không làm sai câu trả lời. Bộ HDFS có hơn 11 triệu bản ghi log, tương ứng hơn 575 nghìn phiên khối. Trong chiến dịch này, em dùng 35 nghìn phiên Train, 7 nghìn 500 phiên Validation và cửa sổ ngữ cảnh dài 256 sự kiện. Con số quy mô là một chuyện; </w:t>
       </w:r>
       <w:r>
         <w:rPr>
           <w:b/>
         </w:rPr>
-        <w:t>thứ tự phân chia</w:t>
+        <w:t>thứ tự chia mới là chỗ cần để ý</w:t>
       </w:r>
       <w:r>
         <w:rPr>
           <w:b w:val="0"/>
         </w:rPr>
-        <w:t>: Train ở trước, Validation ở sau theo thời gian; phiên giữa các phân vùng không chồng lấn, và vùng giáp ranh được loại bỏ.</w:t>
+        <w:t>. Train nằm trước Validation theo thời gian, các phiên không chồng lấn giữa hai phần, và vùng giáp ranh được loại bỏ.</w:t>
       </w:r>
     </w:p>
     <w:p>
@@ -290,7 +326,7 @@
         <w:rPr>
           <w:b w:val="0"/>
         </w:rPr>
-        <w:t>Nếu trộn ngẫu nhiên những phiên có liên hệ thời gian rồi mới chia, ta có nguy cơ cho mô hình nhìn thấy ở Train những dấu vết rất gần với mẫu Validation. Khi ấy điểm số có thể đẹp nhưng câu hỏi nghiên cứu lại bị trả lời sai. Quy trình ở đây cố gắng chặn con đường đó bằng manifest, mã băm danh sách phiên và những bất biến phân chia trong mã nguồn.</w:t>
+        <w:t>Nếu trộn ngẫu nhiên những phiên gần nhau rồi mới chia, mô hình có thể đã gặp ở Train dấu vết rất giống những gì nó sẽ thấy ở Validation. Khi đó điểm cao chưa chắc là năng lực khái quát. Để kiểm tra việc chia này, em lưu danh sách phiên trong manifest, mã băm danh sách ấy và các điều kiện bất biến trong mã nguồn. Như vậy, người khác có thể đối chiếu lại thay vì chỉ tin vào mô tả trong báo cáo.</w:t>
       </w:r>
     </w:p>
     <w:p>
@@ -299,7 +335,19 @@
         <w:rPr>
           <w:b w:val="0"/>
         </w:rPr>
-        <w:t>Tập Test vẫn niêm phong. Em sẽ nhắc lại giới hạn này ở phần kết quả: những số AP và ROC-AUC sắp trình bày là trên Validation. Chúng có ích để so sánh các nhánh trong cùng phép thử, nhưng chưa phải điểm số cuối cùng trên Test.</w:t>
+        <w:t xml:space="preserve">Tập Test vẫn được niêm phong. Vì thế, từ đây đến hết phần kết quả, khi em nói AP hay ROC-AUC thì đó là số trên </w:t>
+      </w:r>
+      <w:r>
+        <w:rPr>
+          <w:b/>
+        </w:rPr>
+        <w:t>HDFS Validation</w:t>
+      </w:r>
+      <w:r>
+        <w:rPr>
+          <w:b w:val="0"/>
+        </w:rPr>
+        <w:t>. Nó dùng để so các nhánh trong cùng phép thử; chưa phải điểm cuối cùng trên Test.</w:t>
       </w:r>
     </w:p>
     <w:p>
@@ -325,7 +373,7 @@
           <w:b/>
           <w:sz w:val="22"/>
         </w:rPr>
-        <w:t>Mốc thời gian: 6:15–7:50</w:t>
+        <w:t>Mốc thời gian: 6:50–8:20</w:t>
       </w:r>
     </w:p>
     <w:p>
@@ -334,19 +382,19 @@
         <w:rPr>
           <w:b w:val="0"/>
         </w:rPr>
-        <w:t xml:space="preserve">Stage A2 học từ ba bài tập: đoán quan hệ bị che, đoán thuộc tính nút bị che và xử lý khoảng thời gian. Trọng số trong hàm mất mát lần lượt là một, một và không phẩy một. Đây là hệ số thiết kế của mục tiêu, </w:t>
+        <w:t xml:space="preserve">Sang phần huấn luyện, Stage A2 cho mô hình học từ ba bài tập: dự đoán quan hệ bị che, dự đoán thuộc tính nút bị che và xử lý khoảng thời gian. Trọng số của ba phần trong hàm mất mát lần lượt là 1,0; 1,0; và 0,1. Đây là cách em đặt trọng số cho mục tiêu học, </w:t>
       </w:r>
       <w:r>
         <w:rPr>
           <w:b/>
         </w:rPr>
-        <w:t>không phải tỷ lệ đóng góp thực tế</w:t>
+        <w:t>không phải số đo xem mỗi loại thông tin đóng góp bao nhiêu vào việc phát hiện tấn công</w:t>
       </w:r>
       <w:r>
         <w:rPr>
           <w:b w:val="0"/>
         </w:rPr>
-        <w:t xml:space="preserve"> của từng loại thông tin vào khả năng phát hiện tấn công.</w:t>
+        <w:t>.</w:t>
       </w:r>
     </w:p>
     <w:p>
@@ -355,7 +403,7 @@
         <w:rPr>
           <w:b w:val="0"/>
         </w:rPr>
-        <w:t>Em báo cáo năm lượt chạy với các seed khác nhau. Cột loss cho biết mức tối ưu đối với bài tập tự giám sát của từng lượt. Nhưng khi rà hồ sơ, không lượt nào khớp trọn vẹn mọi điều kiện của giao thức chuẩn: có trường hợp lịch học cũ, dừng sớm, thiếu hồ sơ hoặc mốc commit không đúng kế hoạch đã khóa. Nói như vậy không có nghĩa cả năm lượt “hỏng”; nó có nghĩa em không được phép gọi chúng là năm lần lặp hoàn toàn tương đương rồi lấy trung bình như thể điều kiện giống nhau.</w:t>
+        <w:t>Em có báo cáo năm lượt chạy với các seed khác nhau. Nhìn vào cột loss, ta biết mỗi lượt tối ưu bài tập tự giám sát đến đâu. Nhưng khi rà lại hồ sơ chạy, cả năm lượt đều có ít nhất một điểm chưa khớp trọn vẹn với giao thức chuẩn đã khóa: có lượt dùng lịch học cũ, có lượt dừng sớm, có lượt thiếu hồ sơ hoặc mốc commit không đúng kế hoạch. Điều này không có nghĩa là phải bỏ hết số liệu. Nó có nghĩa là em phải ghi đúng hoàn cảnh của từng lượt, không gom chúng thành năm phép lặp hoàn toàn tương đương rồi rút ra một kết luận quá tay.</w:t>
       </w:r>
     </w:p>
     <w:p>
@@ -364,7 +412,7 @@
         <w:rPr>
           <w:b w:val="0"/>
         </w:rPr>
-        <w:t>Quan trọng hơn, loss thấp chưa chứng minh biểu diễn có ích cho an ninh. Mô hình có thể giải tốt bài tập che quan hệ nhưng không giúp tách lớp bất thường. Vì vậy, muốn kiểm tra giả thuyết về chất lượng biểu diễn, em chuyển sang đầu dò hạ nguồn với trọng số backbone đã đóng băng.</w:t>
+        <w:t>Thêm một việc nữa: loss thấp chỉ cho thấy mô hình làm tốt các bài tập tự giám sát ấy. Nó chưa chứng minh vector giúp phát hiện bất thường tốt hơn. Muốn biết điều đó, em lấy các backbone đã đóng băng, trích xuất vector và kiểm tra bằng đầu dò tuyến tính. Kết quả của phép kiểm tra này là phần tiếp theo.</w:t>
       </w:r>
     </w:p>
     <w:p>
@@ -390,7 +438,7 @@
           <w:b/>
           <w:sz w:val="22"/>
         </w:rPr>
-        <w:t>Mốc thời gian: 7:50–9:15</w:t>
+        <w:t>Mốc thời gian: 8:20–9:45</w:t>
       </w:r>
     </w:p>
     <w:p>
@@ -399,7 +447,13 @@
         <w:rPr>
           <w:b w:val="0"/>
         </w:rPr>
-        <w:t>Giao thức V3 dùng sáu bộ trích xuất cố định: ba Sequence-Only và ba Multi-View theo các seed ghép cặp. Với mỗi bộ, đầu dò tuyến tính học trên 35 nghìn vector Train rồi được đo trên 7 nghìn 500 vector Validation; backbone không cập nhật. Em đã chạy lại trích xuất và fit đầu dò từ cả sáu checkpoint trên GPU. Các số in ra khớp Word ở độ chính xác báo cáo. Đây là đánh giá lại checkpoint, chưa phải huấn luyện lại Stage A2.</w:t>
+        <w:t xml:space="preserve">Ở giao thức V3, em so sáu bộ trích xuất cố định: ba Sequence-Only và ba Multi-View, ghép theo cùng ba seed. Với từng bộ, em tạo 35 nghìn vector Train để học đầu dò tuyến tính, rồi đo trên 7 nghìn 500 vector Validation. Trong suốt bước ấy, backbone không được cập nhật. Em cũng đã chạy lại việc trích xuất và huấn luyện đầu dò từ đủ sáu checkpoint trên GPU; các số thu được khớp với Word ở độ chính xác báo cáo. </w:t>
+      </w:r>
+      <w:r>
+        <w:rPr>
+          <w:b/>
+        </w:rPr>
+        <w:t>Đây là đánh giá lại checkpoint, không phải huấn luyện lại Stage A2.</w:t>
       </w:r>
     </w:p>
     <w:p>
@@ -408,19 +462,7 @@
         <w:rPr>
           <w:b w:val="0"/>
         </w:rPr>
-        <w:t xml:space="preserve">Sequence-Only đạt AP bằng một trên cả ba seed. Multi-View đạt khoảng 0,76; 0,63; và 0,59, trung bình 0,6608. AP cho biết thứ hạng của lớp dương trong bài toán này; ROC-AUC nhìn khả năng phân biệt hai lớp trên toàn dải ngưỡng. Kết quả AP bằng một là rất cao, nhưng em chỉ phát biểu đúng phạm vi: </w:t>
-      </w:r>
-      <w:r>
-        <w:rPr>
-          <w:b/>
-        </w:rPr>
-        <w:t>đó là kết quả quan sát trên HDFS Validation theo giao thức V3</w:t>
-      </w:r>
-      <w:r>
-        <w:rPr>
-          <w:b w:val="0"/>
-        </w:rPr>
-        <w:t>. Nó không phải chứng cứ rằng mô hình sẽ không mắc lỗi ở một tập dữ liệu khác.</w:t>
+        <w:t>Nhìn vào bảng, Sequence-Only đạt AP bằng 1,0000 ở cả ba seed. Multi-View lần lượt khoảng 0,76; 0,63; và 0,59, trung bình là 0,6608. AP phản ánh chất lượng xếp hạng lớp dương; còn ROC-AUC nhìn khả năng phân biệt hai lớp trên nhiều ngưỡng. AP bằng một là kết quả rất cao, nên càng phải nói cho chặt: đây là quan sát trên HDFS Validation theo đúng giao thức V3. Nó không bảo đảm kết quả tương tự trên tập khác, và cũng không tự chứng minh vector đã hiểu mọi tín hiệu an ninh.</w:t>
       </w:r>
     </w:p>
     <w:p>
@@ -429,7 +471,7 @@
         <w:rPr>
           <w:b w:val="0"/>
         </w:rPr>
-        <w:t>Điều có thể rút ra ngay từ bảng là Multi-View thấp hơn Sequence-Only ở cả ba seed. Đây là điểm trái với kỳ vọng khi thiết kế kiến trúc. Em không bỏ qua nó; em dùng nó để kiểm tra trực tiếp giả thuyết H2 ở slide sau.</w:t>
+        <w:t>Điều rõ nhất ở bảng này là Multi-View thấp hơn Sequence-Only ở cả ba cặp seed. Kết quả ấy ngược với kỳ vọng ban đầu khi em ghép thêm nhánh đồ thị. Vậy thay vì giải thích cho qua, em đem chính sự chênh lệch này kiểm tra giả thuyết H2.</w:t>
       </w:r>
     </w:p>
     <w:p>
@@ -455,7 +497,7 @@
           <w:b/>
           <w:sz w:val="22"/>
         </w:rPr>
-        <w:t>Mốc thời gian: 9:15–11:10</w:t>
+        <w:t>Mốc thời gian: 9:45–11:25</w:t>
       </w:r>
     </w:p>
     <w:p>
@@ -464,7 +506,7 @@
         <w:rPr>
           <w:b w:val="0"/>
         </w:rPr>
-        <w:t>H2 hỏi liệu Multi-View có ít nhất không thua kém Sequence-Only hay không. “Không thua kém” phải có ngưỡng cụ thể, chứ không thể nhìn bảng rồi mới đặt ngưỡng. Trong chuyên đề, biên AP được đặt trước là âm 0,02. Em lấy AP Multi-View trừ AP Sequence theo từng seed. Ba độ lệch là âm 0,2396; âm 0,3691; và âm 0,4089. Cả ba đều vượt xa biên theo chiều bất lợi. Trung bình là âm 0,3392; số cộng trừ đi kèm là độ lệch chuẩn mẫu qua ba seed, không phải khoảng tin cậy.</w:t>
+        <w:t>H2 đặt câu hỏi: Multi-View có ít nhất là không thua kém Sequence-Only không? Muốn trả lời thì phải có biên đặt trước, không thể thấy số rồi mới chọn một ngưỡng thuận lợi. Ở đây, biên không thua kém của AP là âm 0,02. Em lấy AP của Multi-View trừ AP của Sequence theo từng seed. Ba độ lệch thu được là âm 0,2396; âm 0,3691; và âm 0,4089. Cả ba đều thấp hơn biên khá xa. Độ lệch trung bình là âm 0,3392; phần cộng trừ đi kèm biểu thị độ lệch chuẩn mẫu qua ba seed, không phải khoảng tin cậy.</w:t>
       </w:r>
     </w:p>
     <w:p>
@@ -473,7 +515,7 @@
         <w:rPr>
           <w:b w:val="0"/>
         </w:rPr>
-        <w:t>Có một cách bắt bẻ hợp lý: Sequence thắng vì được nhìn trực tiếp các khe tham số, còn Multi-View thì không. Em đã kiểm tra đúng điểm này bằng cách che tham số của Sequence trên cả Train và Validation, lấy lại biểu diễn rồi huấn luyện một đầu dò mới. Trong phép kiểm tra ấy, AP của Sequence vẫn bằng một ở cả ba seed. Như vậy, lời giải thích “chỉ vì Sequence thấy tham số đầu vào” không phù hợp với kết quả của phép kiểm tra cụ thể này.</w:t>
+        <w:t>Đến đây có một câu hỏi rất đáng đặt ra: liệu Sequence thắng chỉ vì nó nhìn trực tiếp các khe tham số, còn Multi-View thì không? Em đã làm thêm một phép kiểm tra cho đúng nghi vấn ấy. Em che tham số đầu vào của Sequence ở cả Train lẫn Validation, trích xuất lại vector, rồi học một đầu dò mới. AP của Sequence trong phép kiểm tra này vẫn bằng một ở cả ba seed. Như vậy, trong phạm vi phép thử đã làm, cách giải thích “thắng chỉ vì nhìn thấy tham số” không đứng vững. Phép thử này cũng không nói rằng tham số chẳng có ích; hai câu hỏi đó khác nhau.</w:t>
       </w:r>
     </w:p>
     <w:p>
@@ -482,19 +524,19 @@
         <w:rPr>
           <w:b w:val="0"/>
         </w:rPr>
-        <w:t xml:space="preserve">Kết luận em bảo vệ là H2 </w:t>
+        <w:t xml:space="preserve">Cho nên, kết luận của em là </w:t>
       </w:r>
       <w:r>
         <w:rPr>
           <w:b/>
         </w:rPr>
-        <w:t>không được hỗ trợ trong đối chứng HDFS Validation đã thực hiện</w:t>
+        <w:t>H2 không được hỗ trợ trên đối chứng HDFS Validation đã thực hiện</w:t>
       </w:r>
       <w:r>
         <w:rPr>
           <w:b w:val="0"/>
         </w:rPr>
-        <w:t>. Em không nói mọi mô hình đa góc nhìn đều kém. Ba seed cũng không đủ để tuyên bố ý nghĩa thống kê rộng hoặc quan hệ nhân quả. Nhưng với biên đặt trước và ba cặp quan sát hiện có, em không thể gọi Multi-View là không thua kém.</w:t>
+        <w:t>. Em không suy từ ba seed ra rằng mọi mô hình đa góc nhìn đều kém, cũng không coi đây là chứng minh quan hệ nhân quả. Nhưng với biên đã chốt và ba cặp quan sát hiện có, em không thể gọi Multi-View là không thua kém.</w:t>
       </w:r>
     </w:p>
     <w:p>
@@ -520,7 +562,7 @@
           <w:b/>
           <w:sz w:val="22"/>
         </w:rPr>
-        <w:t>Mốc thời gian: 11:10–13:10</w:t>
+        <w:t>Mốc thời gian: 11:25–13:20</w:t>
       </w:r>
     </w:p>
     <w:p>
@@ -529,7 +571,7 @@
         <w:rPr>
           <w:b w:val="0"/>
         </w:rPr>
-        <w:t>H1 hỏi liệu tham số động có được giữ lại với ý nghĩa an ninh hay không. Trở ngại là nhãn tham số nằm ở cấp token hoặc khe tham số, còn vector mang đi đánh giá là một vector gộp 128 chiều cho cả phiên. Đây là lệch cấp độ mục tiêu. Nếu em dùng điểm phát hiện bất thường cấp phiên để xác nhận H1, em đã trả lời một câu hỏi khác.</w:t>
+        <w:t>Sang H1, câu hỏi lại khác: thông tin tham số động có còn trong vector với đúng ý nghĩa an ninh hay không? Chỗ khó nằm ở cấp độ đo. Nhãn của tham số ở cấp token hoặc khe tham số, còn vector em đem đánh giá là một vector 128 chiều gộp cho cả phiên. Nếu lấy điểm phát hiện bất thường cấp phiên để khẳng định H1, thực ra em đã đổi câu hỏi mà không nói ra.</w:t>
       </w:r>
     </w:p>
     <w:p>
@@ -538,19 +580,19 @@
         <w:rPr>
           <w:b w:val="0"/>
         </w:rPr>
-        <w:t xml:space="preserve">Vì chưa đo trực tiếp được, em làm phép thử gián tiếp: giữ nguyên mô hình Sequence, che các khe tham số đầu vào rồi so vector với trường hợp không che. Cosine từ 0,8201 đến 0,9581 và khoảng cách Euclid khác không cho thấy vector đã thay đổi. Nhưng AP phát hiện bất thường vẫn bằng một. Cách đọc đúng là: </w:t>
+        <w:t xml:space="preserve">Vì chưa có phép đo trực tiếp ở cấp tham số, em làm một phép thử gián tiếp. Em giữ nguyên mô hình Sequence, che các khe tham số ở đầu vào, rồi so vector trước và sau khi che. Cosine nằm từ 0,8201 đến 0,9581; khoảng cách Euclid cũng khác không. Nghĩa là vector có phản ứng với thao tác che. Nhưng AP phát hiện bất thường vẫn bằng một. </w:t>
       </w:r>
       <w:r>
         <w:rPr>
           <w:b/>
         </w:rPr>
-        <w:t>vector nhạy với thao tác che tham số; phép thử này chưa cho biết nó hiểu hoặc giữ đúng ngữ nghĩa tham số đến mức nào</w:t>
+        <w:t>Điều phép thử cho thấy là vector có thay đổi; điều nó chưa cho thấy là mô hình đã giữ đúng ngữ nghĩa của tham số.</w:t>
       </w:r>
       <w:r>
         <w:rPr>
           <w:b w:val="0"/>
         </w:rPr>
-        <w:t>. Cũng chưa thể kết luận tham số là vô ích: bài toán hạ nguồn HDFS này có thể được giải bằng những tín hiệu khác.</w:t>
+        <w:t xml:space="preserve"> Cũng không thể đảo lại mà bảo tham số vô ích, vì bài toán HDFS ở cấp phiên có thể còn những tín hiệu khác để giải.</w:t>
       </w:r>
     </w:p>
     <w:p>
@@ -559,7 +601,7 @@
         <w:rPr>
           <w:b w:val="0"/>
         </w:rPr>
-        <w:t>Ở nửa còn lại là lượt chạy lại thủ công Sequence seed 42. Mô hình chạy sáu epoch; checkpoint tốt nhất ở epoch ba; loss Validation tốt nhất là 0,009218; bộ nhớ GPU đỉnh khoảng 170,45 MB. Hai số AP 0,899385 và 1,0000 nằm cạnh nhau nhưng thuộc hai giao thức khác nhau: một đầu dò nội bộ chia Validation 80/20, và một đầu dò V3 học trên Train rồi đánh giá trên Validation. Em giữ cả hai để người đọc thấy quá trình, đồng thời ghi rõ không được so chúng như hai phép đo đồng nhất.</w:t>
+        <w:t>Em cũng đưa lên slide lượt chạy lại thủ công của Sequence seed 42 để người đọc thấy thêm một lát cắt của quá trình. Lượt này chạy sáu epoch, checkpoint tốt nhất ở epoch ba; loss Validation tốt nhất là 0,009218 và bộ nhớ GPU đỉnh khoảng 170,45 MB. Có hai số AP dễ bị nhìn thành một phép so: 0,899385 và 1,0000. Thực ra chúng thuộc hai giao thức khác nhau. Số thứ nhất đến từ đầu dò nội bộ chia Validation theo tỷ lệ 80/20; số thứ hai là đầu dò V3 học trên Train rồi đánh giá trên Validation. Em giữ cả hai số, nhưng không coi chênh lệch giữa chúng là mức cải thiện của cùng một thí nghiệm.</w:t>
       </w:r>
     </w:p>
     <w:p>
@@ -585,7 +627,7 @@
           <w:b/>
           <w:sz w:val="22"/>
         </w:rPr>
-        <w:t>Mốc thời gian: 13:10–15:00</w:t>
+        <w:t>Mốc thời gian: 13:20–15:00</w:t>
       </w:r>
     </w:p>
     <w:p>
@@ -594,7 +636,7 @@
         <w:rPr>
           <w:b w:val="0"/>
         </w:rPr>
-        <w:t>Đóng góp của chuyên đề có ba phần. Thứ nhất là Hợp đồng Biểu diễn: một cách đặt tiêu chí cụ thể cho vector log. Thứ hai là tích hợp kiến trúc chuỗi và đồ thị theo thời gian; em không tuyên bố các khối nguyên thủy như Transformer hay VICReg là thuật toán do em phát minh. Thứ ba là hạ tầng thực nghiệm và đối soát: từ phân chia dữ liệu, đầu dò đóng băng, đến việc công khai các sai lệch thủ tục và kết quả âm tính.</w:t>
+        <w:t>Đến đây em xin chốt lại chuyên đề đóng góp gì và bằng chứng hiện có đi được đến đâu. Phần thứ nhất là Hợp đồng Biểu diễn: đặt ra những tiêu chí cụ thể để kiểm tra một vector log. Phần thứ hai là thiết kế kết hợp chuỗi với đồ thị theo thời gian. Em dùng các khối như Transformer và VICReg trong thiết kế, chứ không nhận đó là thuật toán do mình phát minh. Phần thứ ba là quy trình thực nghiệm có thể đối soát: từ cách chia dữ liệu, đầu dò với backbone đóng băng, đến việc ghi lại cả sai lệch thủ tục lẫn kết quả không thuận với giả thuyết.</w:t>
       </w:r>
     </w:p>
     <w:p>
@@ -603,7 +645,7 @@
         <w:rPr>
           <w:b w:val="0"/>
         </w:rPr>
-        <w:t>Trạng thái bằng chứng hiện nay cũng phải tách rõ. H1 chưa được kiểm tra trực tiếp; H2 không được hỗ trợ trong đối chứng HDFS Validation; H3 đến H5 chưa có thực nghiệm xác nhận. ER1 mới có quan sát bộ nhớ, chưa có số đo thông lượng và độ trễ. Graph-Only xác nhận mới chưa được huấn luyện theo V3, còn Test vẫn niêm phong.</w:t>
+        <w:t>Nếu tách từng giả thuyết ra thì bức tranh hiện nay khá rõ. H1 chưa được kiểm tra trực tiếp ở đúng cấp tham số. H2 không được hỗ trợ trên HDFS Validation. H3 đến H5 chưa có thực nghiệm xác nhận. Với ER1, em mới có quan sát về bộ nhớ, chưa có số đo thông lượng và độ trễ. Graph-Only xác nhận mới chưa được huấn luyện theo V3, và tập Test vẫn niêm phong.</w:t>
       </w:r>
     </w:p>
     <w:p>
@@ -612,7 +654,7 @@
         <w:rPr>
           <w:b w:val="0"/>
         </w:rPr>
-        <w:t>Theo em, kết quả âm tính ở H2 không làm chuyên đề mất giá trị. Nó chỉ ra đúng chỗ giả định kiến trúc chưa đứng vững: thêm góc nhìn đồ thị đã không tạo ra lợi ích trên phép thử này. Hướng tiếp theo không phải chỉnh cách kể để biến kết quả thành tích cực, mà là đo H1 ở đúng cấp token, tìm nguyên nhân Multi-View giảm hiệu năng, thử trên dữ liệu có cấu trúc quan hệ phong phú hơn, rồi mới mở Test theo giao thức khóa trước. Đó là phạm vi em có thể bảo vệ bằng dữ liệu đang có. Em xin cảm ơn cô và các thầy cô.</w:t>
+        <w:t>Theo em, kết quả âm tính của H2 không phải điều cần giấu. Nó chỉ đúng chỗ giả định thiết kế chưa được dữ liệu ủng hộ: thêm góc nhìn đồ thị vào đã không mang lại lợi ích trong phép thử này. Việc tiếp theo là đo H1 ở cấp token, tìm xem vì sao Multi-View giảm hiệu năng, thử trên dữ liệu có quan hệ phong phú hơn, rồi mới mở Test theo giao thức đã khóa trước. Em xin dừng ở những kết luận mà số liệu hiện có thực sự cho phép. Em cảm ơn cô và các thầy cô đã lắng nghe.</w:t>
       </w:r>
     </w:p>
     <w:sectPr>

</xml_diff>

<commit_message>
docs(defense): state backbone behavior precisely in speaking notes
</commit_message>
<xml_diff>
--- a/bao-ve/LOI-THUYET-TRINH-15-PHUT.docx
+++ b/bao-ve/LOI-THUYET-TRINH-15-PHUT.docx
@@ -205,7 +205,7 @@
         <w:rPr>
           <w:b w:val="0"/>
         </w:rPr>
-        <w:t>Vì vậy, khi đánh giá, em tách bộ tạo vector ra khỏi bộ phân loại. Em đóng băng trọng số bộ tạo vector, rồi chỉ huấn luyện một đầu dò tuyến tính trên các vector đã có. Nếu đầu dò làm tốt, ta biết thông tin hữu ích có thể đọc ra theo cách tuyến tính. Còn những thông tin phi tuyến khác có hay không, phép đo này tự nó chưa kết luận được. Cách tách ấy cũng giúp em nói đúng phạm vi của mỗi kết quả ở các slide sau.</w:t>
+        <w:t>Vì vậy, khi đánh giá, em tách bộ tạo vector ra khỏi bộ phân loại. Em dùng checkpoint đã huấn luyện để trích xuất vector mà không cập nhật tham số bộ tạo vector; phần được huấn luyện ở bước này chỉ là đầu dò tuyến tính trên vector Train. Nếu đầu dò làm tốt, ta biết thông tin hữu ích có thể đọc ra theo cách tuyến tính. Còn những thông tin phi tuyến khác có hay không, phép đo này tự nó chưa kết luận được. Cách tách ấy cũng giúp em nói đúng phạm vi của mỗi kết quả ở các slide sau.</w:t>
       </w:r>
     </w:p>
     <w:p>
@@ -412,7 +412,7 @@
         <w:rPr>
           <w:b w:val="0"/>
         </w:rPr>
-        <w:t>Thêm một việc nữa: loss thấp chỉ cho thấy mô hình làm tốt các bài tập tự giám sát ấy. Nó chưa chứng minh vector giúp phát hiện bất thường tốt hơn. Muốn biết điều đó, em lấy các backbone đã đóng băng, trích xuất vector và kiểm tra bằng đầu dò tuyến tính. Kết quả của phép kiểm tra này là phần tiếp theo.</w:t>
+        <w:t>Thêm một việc nữa: loss thấp chỉ cho thấy mô hình làm tốt các bài tập tự giám sát ấy. Nó chưa chứng minh vector giúp phát hiện bất thường tốt hơn. Muốn biết điều đó, em dùng các checkpoint đã huấn luyện để trích xuất vector, không cập nhật backbone trong bước đánh giá, rồi kiểm tra bằng đầu dò tuyến tính. Kết quả của phép kiểm tra này là phần tiếp theo.</w:t>
       </w:r>
     </w:p>
     <w:p>
@@ -636,7 +636,7 @@
         <w:rPr>
           <w:b w:val="0"/>
         </w:rPr>
-        <w:t>Đến đây em xin chốt lại chuyên đề đóng góp gì và bằng chứng hiện có đi được đến đâu. Phần thứ nhất là Hợp đồng Biểu diễn: đặt ra những tiêu chí cụ thể để kiểm tra một vector log. Phần thứ hai là thiết kế kết hợp chuỗi với đồ thị theo thời gian. Em dùng các khối như Transformer và VICReg trong thiết kế, chứ không nhận đó là thuật toán do mình phát minh. Phần thứ ba là quy trình thực nghiệm có thể đối soát: từ cách chia dữ liệu, đầu dò với backbone đóng băng, đến việc ghi lại cả sai lệch thủ tục lẫn kết quả không thuận với giả thuyết.</w:t>
+        <w:t>Đến đây em xin chốt lại chuyên đề đóng góp gì và bằng chứng hiện có đi được đến đâu. Phần thứ nhất là Hợp đồng Biểu diễn: đặt ra những tiêu chí cụ thể để kiểm tra một vector log. Phần thứ hai là thiết kế kết hợp chuỗi với đồ thị theo thời gian. Em dùng các khối như Transformer và VICReg trong thiết kế, chứ không nhận đó là thuật toán do mình phát minh. Phần thứ ba là quy trình thực nghiệm có thể đối soát: từ cách chia dữ liệu, đánh giá đầu dò mà không cập nhật backbone, đến việc ghi lại cả sai lệch thủ tục lẫn kết quả không thuận với giả thuyết.</w:t>
       </w:r>
     </w:p>
     <w:p>

</xml_diff>

<commit_message>
docs(defense): ground final slides and speech in code and V3 evidence
</commit_message>
<xml_diff>
--- a/bao-ve/LOI-THUYET-TRINH-15-PHUT.docx
+++ b/bao-ve/LOI-THUYET-TRINH-15-PHUT.docx
@@ -15,7 +15,7 @@
         <w:spacing w:after="240"/>
       </w:pPr>
       <w:r>
-        <w:t>Bản luyện nói theo 10 slide. Mốc thời gian dùng để tập thử; khi luyện nên bấm giờ và nghỉ ngắn ở chỗ xuống đoạn. Chữ in đậm là ý cần nhấn.</w:t>
+        <w:t>Bản nói theo 10 slide. Các mốc để tập bấm giờ; nếu cần rút ngắn, chỉ lược câu chuyển ý, không lược phạm vi của kết quả. Khi chỉ mã trong VS Code, dùng kịch bản riêng KICH-BAN-DEMO-VSCODE.md sau phần trình bày.</w:t>
       </w:r>
     </w:p>
     <w:p>
@@ -36,7 +36,7 @@
           <w:b/>
           <w:sz w:val="22"/>
         </w:rPr>
-        <w:t>Mốc thời gian: 0:00–0:45</w:t>
+        <w:t>Mốc thời gian: 0:00–0:30</w:t>
       </w:r>
     </w:p>
     <w:p>
@@ -45,7 +45,7 @@
         <w:rPr>
           <w:b w:val="0"/>
         </w:rPr>
-        <w:t>Kính thưa cô và các thầy cô, em là Đoàn Ngọc Hoàng Minh. Hôm nay em xin trình bày chuyên đề về cách tạo đặc trưng từ log để phục vụ phát hiện tấn công. Thoạt nhìn, việc này giống như chuyển các dòng log thành vector. Nhưng điều em thực sự muốn hỏi là: sau khi gộp nhiều sự kiện vào một vector, những thông tin có ích cho an ninh còn giữ được đến đâu? Và mình kiểm tra việc ấy bằng cách nào, thay vì chỉ thấy điểm đánh giá cao rồi cho rằng mô hình đã học đúng? Em sẽ đi từ câu hỏi đó đến cách làm, sau đó nói thẳng về kết quả thực nghiệm, kể cả chỗ kết quả không đúng với dự kiến ban đầu.</w:t>
+        <w:t>Kính thưa cô và các thầy cô, em là Đoàn Ngọc Hoàng Minh. Chuyên đề của em tìm cách biến log thành vector để phục vụ phát hiện bất thường. Câu hỏi chính là: vector ấy giữ được thông tin gì, và mình kiểm tra bằng cách nào? Em xin nói ngắn phần đặt vấn đề để dành thời gian cho dữ liệu, mã và kết quả, kể cả kết quả không thuận với giả thuyết ban đầu.</w:t>
       </w:r>
     </w:p>
     <w:p>
@@ -58,7 +58,7 @@
         <w:pStyle w:val="Heading1"/>
       </w:pPr>
       <w:r>
-        <w:t>Slide 2 — Vì sao biểu diễn log khó</w:t>
+        <w:t>Slide 2 — Log cần ngữ cảnh</w:t>
       </w:r>
     </w:p>
     <w:p>
@@ -71,7 +71,7 @@
           <w:b/>
           <w:sz w:val="22"/>
         </w:rPr>
-        <w:t>Mốc thời gian: 0:45–2:15</w:t>
+        <w:t>Mốc thời gian: 0:30–1:20</w:t>
       </w:r>
     </w:p>
     <w:p>
@@ -80,7 +80,7 @@
         <w:rPr>
           <w:b w:val="0"/>
         </w:rPr>
-        <w:t>Trước hết, vì sao phải nghĩ lại cách biểu diễn log? Một dòng log đứng riêng thường chưa nói được nhiều. Cùng một sự kiện, nhưng xảy ra sau chuỗi nào, gắn với thực thể nào, mang tham số gì, thì ý nghĩa an ninh có thể khác. Nếu chỉ đếm mẫu log, ta thấy tần suất nhưng dễ mất các quan hệ ấy. Nếu đọc theo chuỗi, ta giữ được diễn biến, còn mối phụ thuộc giữa nhiều thực thể thì chưa chắc đã rõ. Đồ thị có thể giúp nhìn quan hệ, nhưng lại tốn thêm chi phí xử lý. Thành ra, chọn cách biểu diễn nào cũng là chọn thứ mình giữ và thứ mình có thể bỏ sót.</w:t>
+        <w:t>Một dòng log đứng riêng thường chưa đủ để hiểu hành vi. Cùng là thao tác đọc tệp, nhưng do tiến trình nào thực hiện và xảy ra sau lệnh nào thì cách đánh giá sẽ khác. Ba cách biểu diễn giữ các phần khác nhau: đếm sự kiện giữ tần suất, chuỗi giữ thứ tự, đồ thị giữ quan hệ thực thể. Cách nào cũng có phần dễ bỏ sót.</w:t>
       </w:r>
     </w:p>
     <w:p>
@@ -89,22 +89,7 @@
         <w:rPr>
           <w:b w:val="0"/>
         </w:rPr>
-        <w:t>Từ phần khảo sát ở Chương 1, em rút ra năm khoảng trống. Trên slide có đủ cả năm; ở đây em xin tập trung vào ba việc dẫn trực tiếp đến thiết kế thực nghiệm: giữ ngữ nghĩa tham số, thử kết hợp chuỗi với đồ thị mà không làm hỏng phần biểu diễn đã tốt, và ngăn rò rỉ dữ liệu khi đánh giá. Hai việc còn lại là nhãn an ninh ở mức thô và quyền riêng tư. Chúng có mặt trong khung thiết kế, nhưng chuyên đề này chưa có thực nghiệm đầy đủ để kết luận về chúng.</w:t>
-      </w:r>
-    </w:p>
-    <w:p>
-      <w:pPr/>
-      <w:r>
-        <w:rPr>
-          <w:b/>
-        </w:rPr>
-        <w:t>Ý chính của slide này là: thêm một mô hình phức tạp chưa chắc đã tốt hơn.</w:t>
-      </w:r>
-      <w:r>
-        <w:rPr>
-          <w:b w:val="0"/>
-        </w:rPr>
-        <w:t xml:space="preserve"> Trước khi so điểm, mình phải nói rõ muốn vector giữ thông tin gì, rồi đặt các mô hình vào cùng một cách chia dữ liệu và một cách đo.</w:t>
+        <w:t>Từ khảo sát ở Chương 1, em rút ra năm khoảng trống. Ở đây em tập trung vào ba điểm: giữ tín hiệu tham số, thử kết hợp chuỗi với đồ thị, và chống rò rỉ khi chia dữ liệu. Nhãn thô và quyền riêng tư vẫn có trong thiết kế nhưng chưa có phép thử đủ để kết luận. Việc thêm nhánh đồ thị mới là giả thuyết cần đối chứng.</w:t>
       </w:r>
     </w:p>
     <w:p>
@@ -117,7 +102,7 @@
         <w:pStyle w:val="Heading1"/>
       </w:pPr>
       <w:r>
-        <w:t>Slide 3 — Hợp đồng Biểu diễn là tiêu chí, không phải lời hứa</w:t>
+        <w:t>Slide 3 — Hợp đồng Biểu diễn</w:t>
       </w:r>
     </w:p>
     <w:p>
@@ -130,7 +115,7 @@
           <w:b/>
           <w:sz w:val="22"/>
         </w:rPr>
-        <w:t>Mốc thời gian: 2:15–4:00</w:t>
+        <w:t>Mốc thời gian: 1:20–2:15</w:t>
       </w:r>
     </w:p>
     <w:p>
@@ -139,43 +124,43 @@
         <w:rPr>
           <w:b w:val="0"/>
         </w:rPr>
-        <w:t xml:space="preserve">Từ câu hỏi vừa rồi, em đặt ra Hợp đồng Biểu diễn. Có thể hiểu đây là bộ tiêu chí để hỏi một vector log cần làm được gì. Nhóm thứ nhất là </w:t>
+        <w:t xml:space="preserve">Để tránh nói chung chung rằng vector “tốt”, em đặt ra Hợp đồng Biểu diễn. </w:t>
       </w:r>
       <w:r>
         <w:rPr>
           <w:b/>
         </w:rPr>
-        <w:t>bảo toàn</w:t>
+        <w:t>PRESERVE</w:t>
       </w:r>
       <w:r>
         <w:rPr>
           <w:b w:val="0"/>
         </w:rPr>
-        <w:t xml:space="preserve">: giữ những dấu hiệu có thể mang ý nghĩa an ninh, như tham số lệnh, thứ tự thời gian và quan hệ phụ thuộc. Nhóm thứ hai là </w:t>
+        <w:t xml:space="preserve"> hỏi tín hiệu cần cho an ninh, như tham số và quan hệ, còn đọc ra được không. </w:t>
       </w:r>
       <w:r>
         <w:rPr>
           <w:b/>
         </w:rPr>
-        <w:t>bất biến</w:t>
+        <w:t>INVARIANT</w:t>
       </w:r>
       <w:r>
         <w:rPr>
           <w:b w:val="0"/>
         </w:rPr>
-        <w:t xml:space="preserve">: nếu một chi tiết vô hại thay đổi, chẳng hạn PID ngẫu nhiên hoặc cách ghi thời gian, thì kết luận không nên thay đổi một cách vô lý. Nhóm cuối là </w:t>
+        <w:t xml:space="preserve"> hỏi thay đổi vô hại như PID ngẫu nhiên có làm vector lệch vô lý không. </w:t>
       </w:r>
       <w:r>
         <w:rPr>
           <w:b/>
         </w:rPr>
-        <w:t>triệt tiêu</w:t>
+        <w:t>EXCLUDE</w:t>
       </w:r>
       <w:r>
         <w:rPr>
           <w:b w:val="0"/>
         </w:rPr>
-        <w:t>: hạn chế dấu vết rò rỉ, dấu vết riêng của môi trường thí nghiệm và định danh nhạy cảm mà mô hình có thể bám vào để học đường tắt.</w:t>
+        <w:t xml:space="preserve"> hỏi mô hình có bám vào dấu vết môi trường hoặc định danh nhạy cảm để học đường tắt không.</w:t>
       </w:r>
     </w:p>
     <w:p>
@@ -184,28 +169,7 @@
         <w:rPr>
           <w:b w:val="0"/>
         </w:rPr>
-        <w:t xml:space="preserve">Đến đây em muốn nói rõ một điểm. Ba nhóm ấy là </w:t>
-      </w:r>
-      <w:r>
-        <w:rPr>
-          <w:b/>
-        </w:rPr>
-        <w:t>điều kiện cần đem ra kiểm tra</w:t>
-      </w:r>
-      <w:r>
-        <w:rPr>
-          <w:b w:val="0"/>
-        </w:rPr>
-        <w:t>, chứ không phải lời khẳng định rằng mô hình của em đã đạt cả ba. Chẳng hạn, muốn nói vector giữ được ý nghĩa của tham số, mình phải đo đúng ở cấp tham số. Một điểm AP phát hiện bất thường ở cấp phiên, dù cao, cũng chưa trả lời được câu hỏi đó.</w:t>
-      </w:r>
-    </w:p>
-    <w:p>
-      <w:pPr/>
-      <w:r>
-        <w:rPr>
-          <w:b w:val="0"/>
-        </w:rPr>
-        <w:t>Vì vậy, khi đánh giá, em tách bộ tạo vector ra khỏi bộ phân loại. Em dùng checkpoint đã huấn luyện để trích xuất vector mà không cập nhật tham số bộ tạo vector; phần được huấn luyện ở bước này chỉ là đầu dò tuyến tính trên vector Train. Nếu đầu dò làm tốt, ta biết thông tin hữu ích có thể đọc ra theo cách tuyến tính. Còn những thông tin phi tuyến khác có hay không, phép đo này tự nó chưa kết luận được. Cách tách ấy cũng giúp em nói đúng phạm vi của mỗi kết quả ở các slide sau.</w:t>
+        <w:t>Đây là tiêu chí để đặt phép đo, chưa phải thành tích đã đạt. Muốn chứng minh ngữ nghĩa một khe tham số được giữ, cần đo đúng cấp khe ấy; điểm bất thường của cả phiên chưa trả lời được. Khi đánh giá, em dùng checkpoint để tạo vector mà không cập nhật bộ tạo vector; chỉ đầu dò tuyến tính được học. Lát nữa em sẽ chỉ đúng đoạn mã.</w:t>
       </w:r>
     </w:p>
     <w:p>
@@ -218,7 +182,7 @@
         <w:pStyle w:val="Heading1"/>
       </w:pPr>
       <w:r>
-        <w:t>Slide 4 — Vì sao thử kết hợp chuỗi và đồ thị</w:t>
+        <w:t>Slide 4 — Thiết kế hai nhánh</w:t>
       </w:r>
     </w:p>
     <w:p>
@@ -231,7 +195,7 @@
           <w:b/>
           <w:sz w:val="22"/>
         </w:rPr>
-        <w:t>Mốc thời gian: 4:00–5:30</w:t>
+        <w:t>Mốc thời gian: 2:15–3:15</w:t>
       </w:r>
     </w:p>
     <w:p>
@@ -240,7 +204,7 @@
         <w:rPr>
           <w:b w:val="0"/>
         </w:rPr>
-        <w:t>Vậy em thử tạo vector bằng cách nào? Kiến trúc có hai nhánh. Nhánh chuỗi dùng Transformer để đọc thứ tự và ngữ cảnh của sự kiện. Nhánh đồ thị dùng Temporal GNN để biểu diễn quan hệ giữa các thực thể theo thời gian. Sau đó, hai nhánh được gióng hàng trong không gian chiếu và kết hợp thành một vector để đánh giá ở bài toán hạ nguồn. Ở đây cũng cần phân biệt: đầu chiếu và các hàm mất mát là phần dùng khi huấn luyện; chi phí suy luận khi triển khai phải được tính theo đường chạy thực tế, chứ không bê nguyên sơ đồ huấn luyện sang.</w:t>
+        <w:t>Thiết kế em khảo sát có một nhánh đọc chuỗi bằng Transformer và một nhánh đọc quan hệ theo thời gian bằng Temporal GNN. Trong đường huấn luyện, hai đầu chiếu đưa vector nhánh vào mất mát gióng hàng VICReg. Nhưng khi lấy vector để đánh giá V3, mã đưa hai biểu diễn gốc vào cổng dung hợp; nó không chạy lại hai đầu chiếu ấy. Đây là chỗ rất dễ nói sai nếu chỉ nhìn sơ đồ kiến trúc.</w:t>
       </w:r>
     </w:p>
     <w:p>
@@ -249,28 +213,7 @@
         <w:rPr>
           <w:b w:val="0"/>
         </w:rPr>
-        <w:t xml:space="preserve">Lý do ghép hai nhánh khá dễ hiểu: chuỗi cho ta diễn biến, còn đồ thị cho ta quan hệ. Nhưng “có lý về mặt thiết kế” chưa có nghĩa là chắc chắn hiệu quả. </w:t>
-      </w:r>
-      <w:r>
-        <w:rPr>
-          <w:b/>
-        </w:rPr>
-        <w:t>Câu hỏi thực nghiệm là: trên dữ liệu này, hai nguồn thông tin có bổ sung cho nhau thật không?</w:t>
-      </w:r>
-      <w:r>
-        <w:rPr>
-          <w:b w:val="0"/>
-        </w:rPr>
-        <w:t xml:space="preserve"> Nếu quan hệ đồ thị chứa nhiều nhiễu, hoặc bước gióng hàng làm mất những khác biệt vốn có ích, Multi-View có thể còn kém đi. Vì thế, em đưa nó vào phép so sánh, chứ không mặc định nó sẽ thắng.</w:t>
-      </w:r>
-    </w:p>
-    <w:p>
-      <w:pPr/>
-      <w:r>
-        <w:rPr>
-          <w:b w:val="0"/>
-        </w:rPr>
-        <w:t>Ở cuối slide là hướng suy luận theo dòng: sự kiện mới đi vào, trạng thái hữu hạn được cập nhật, rồi tạo vector tại thời điểm đó. Phần này mới là thiết kế. Với HDFS, em chưa đo toàn trình thông lượng và độ trễ, nên chưa thể nói hệ thống đã đáp ứng yêu cầu thời gian thực.</w:t>
+        <w:t>Chuỗi giúp nhìn diễn biến, đồ thị giúp nhìn phụ thuộc giữa thực thể. Hai nguồn nghe có vẻ bổ sung cho nhau, nhưng dữ liệu và cách học quyết định nó có bổ sung thật hay không. Vì thế em không coi Multi-View chắc chắn tốt hơn. Thiết kế còn mô tả cập nhật theo dòng; chuyên đề chưa đo thông lượng và độ trễ toàn trình, nên em cũng chưa nhận là đã chứng minh khả năng thời gian thực.</w:t>
       </w:r>
     </w:p>
     <w:p>
@@ -283,7 +226,7 @@
         <w:pStyle w:val="Heading1"/>
       </w:pPr>
       <w:r>
-        <w:t>Slide 5 — Chặn rò rỉ từ khâu chia dữ liệu</w:t>
+        <w:t>Slide 5 — Dữ liệu và phép chia</w:t>
       </w:r>
     </w:p>
     <w:p>
@@ -296,7 +239,7 @@
           <w:b/>
           <w:sz w:val="22"/>
         </w:rPr>
-        <w:t>Mốc thời gian: 5:30–6:50</w:t>
+        <w:t>Mốc thời gian: 3:15–4:30</w:t>
       </w:r>
     </w:p>
     <w:p>
@@ -305,19 +248,19 @@
         <w:rPr>
           <w:b w:val="0"/>
         </w:rPr>
-        <w:t xml:space="preserve">Trước khi xem mô hình học được gì, phải chắc rằng cách chia dữ liệu không làm sai câu trả lời. Bộ HDFS có hơn 11 triệu bản ghi log, tương ứng hơn 575 nghìn phiên khối. Trong chiến dịch này, em dùng 35 nghìn phiên Train, 7 nghìn 500 phiên Validation và cửa sổ ngữ cảnh dài 256 sự kiện. Con số quy mô là một chuyện; </w:t>
+        <w:t xml:space="preserve">Trước khi nói đến điểm AP, em xin chỉ nguồn của các con số. Ngữ liệu HDFS gốc có 11.175.629 dòng log, gom thành 575.061 phiên khối có nhãn. Đây là quy mô </w:t>
       </w:r>
       <w:r>
         <w:rPr>
           <w:b/>
         </w:rPr>
-        <w:t>thứ tự chia mới là chỗ cần để ý</w:t>
+        <w:t>toàn ngữ liệu</w:t>
       </w:r>
       <w:r>
         <w:rPr>
           <w:b w:val="0"/>
         </w:rPr>
-        <w:t>. Train nằm trước Validation theo thời gian, các phiên không chồng lấn giữa hai phần, và vùng giáp ranh được loại bỏ.</w:t>
+        <w:t>. Phép thử V3 dùng một tập con theo ngân sách: 35.000 phiên Train và 7.500 phiên Validation; không được lấy 11 triệu dòng để gọi là số mẫu huấn luyện của đầu dò.</w:t>
       </w:r>
     </w:p>
     <w:p>
@@ -326,7 +269,7 @@
         <w:rPr>
           <w:b w:val="0"/>
         </w:rPr>
-        <w:t>Nếu trộn ngẫu nhiên những phiên gần nhau rồi mới chia, mô hình có thể đã gặp ở Train dấu vết rất giống những gì nó sẽ thấy ở Validation. Khi đó điểm cao chưa chắc là năng lực khái quát. Để kiểm tra việc chia này, em lưu danh sách phiên trong manifest, mã băm danh sách ấy và các điều kiện bất biến trong mã nguồn. Như vậy, người khác có thể đối chiếu lại thay vì chỉ tin vào mô tả trong báo cáo.</w:t>
+        <w:t>Trong mã và manifest, phiên được xếp theo thời điểm bắt đầu. Những phiên bắc qua ranh giới Train–Validation hoặc Validation–Test bị loại, rồi mới chọn tập con. Từ vựng được khớp trên Train. Các tệp SPL-HDFS-001.json và SUBSET-MANIFEST-HDFS.json ghi số lượng, thời gian và mã băm của phép chia; mã thực hiện nằm ở hdfs_split_authority.py. Khi cô hỏi có thể mở đúng ba tệp ấy để đối chiếu.</w:t>
       </w:r>
     </w:p>
     <w:p>
@@ -335,19 +278,7 @@
         <w:rPr>
           <w:b w:val="0"/>
         </w:rPr>
-        <w:t xml:space="preserve">Tập Test vẫn được niêm phong. Vì thế, từ đây đến hết phần kết quả, khi em nói AP hay ROC-AUC thì đó là số trên </w:t>
-      </w:r>
-      <w:r>
-        <w:rPr>
-          <w:b/>
-        </w:rPr>
-        <w:t>HDFS Validation</w:t>
-      </w:r>
-      <w:r>
-        <w:rPr>
-          <w:b w:val="0"/>
-        </w:rPr>
-        <w:t>. Nó dùng để so các nhánh trong cùng phép thử; chưa phải điểm cuối cùng trên Test.</w:t>
+        <w:t>Manifest ghi Test ở trạng thái SEALED, chưa vật hóa đặc trưng Test cho người huấn luyện. Phần báo cáo này chỉ dùng kết quả trên Validation. Một tệp manifest không tự chứng minh mọi lần chạy trong lịch sử không bao giờ truy cập Test; điều em có thể trình ra là giao thức, chỉ mục và trạng thái artifact của chiến dịch đang báo cáo.</w:t>
       </w:r>
     </w:p>
     <w:p>
@@ -360,7 +291,7 @@
         <w:pStyle w:val="Heading1"/>
       </w:pPr>
       <w:r>
-        <w:t>Slide 6 — Huấn luyện tự giám sát và kiểm toán thủ tục</w:t>
+        <w:t>Slide 6 — Stage A2: công thức và mã huấn luyện</w:t>
       </w:r>
     </w:p>
     <w:p>
@@ -373,7 +304,7 @@
           <w:b/>
           <w:sz w:val="22"/>
         </w:rPr>
-        <w:t>Mốc thời gian: 6:50–8:20</w:t>
+        <w:t>Mốc thời gian: 4:30–6:35</w:t>
       </w:r>
     </w:p>
     <w:p>
@@ -382,19 +313,19 @@
         <w:rPr>
           <w:b w:val="0"/>
         </w:rPr>
-        <w:t xml:space="preserve">Sang phần huấn luyện, Stage A2 cho mô hình học từ ba bài tập: dự đoán quan hệ bị che, dự đoán thuộc tính nút bị che và xử lý khoảng thời gian. Trọng số của ba phần trong hàm mất mát lần lượt là 1,0; 1,0; và 0,1. Đây là cách em đặt trọng số cho mục tiêu học, </w:t>
+        <w:t xml:space="preserve">Bây giờ đến phần mã huấn luyện. Trên slide là công thức đang dùng cho mất mát đồ thị Stage A2: </w:t>
       </w:r>
       <w:r>
         <w:rPr>
           <w:b/>
         </w:rPr>
-        <w:t>không phải số đo xem mỗi loại thông tin đóng góp bao nhiêu vào việc phát hiện tấn công</w:t>
+        <w:t>L_graph bằng L_rel cộng L_node cộng 0,1 lần L_time</w:t>
       </w:r>
       <w:r>
         <w:rPr>
           <w:b w:val="0"/>
         </w:rPr>
-        <w:t>.</w:t>
+        <w:t>. Ba số hạng lần lượt là sai số dự đoán quan hệ bị che, tái tạo thuộc tính nút bị che và dự đoán khoảng thời gian. Trước khi cộng, mã chia tổng sai số từng loại cho số mục tiêu hợp lệ của loại ấy. Thành ra hệ số 0,1 là trọng số trong mục tiêu tối ưu; không thể đọc nó thành “thời gian chỉ đóng góp 10% vào AP”.</w:t>
       </w:r>
     </w:p>
     <w:p>
@@ -403,7 +334,7 @@
         <w:rPr>
           <w:b w:val="0"/>
         </w:rPr>
-        <w:t>Em có báo cáo năm lượt chạy với các seed khác nhau. Nhìn vào cột loss, ta biết mỗi lượt tối ưu bài tập tự giám sát đến đâu. Nhưng khi rà lại hồ sơ chạy, cả năm lượt đều có ít nhất một điểm chưa khớp trọn vẹn với giao thức chuẩn đã khóa: có lượt dùng lịch học cũ, có lượt dừng sớm, có lượt thiếu hồ sơ hoặc mốc commit không đúng kế hoạch. Điều này không có nghĩa là phải bỏ hết số liệu. Nó có nghĩa là em phải ghi đúng hoàn cảnh của từng lượt, không gom chúng thành năm phép lặp hoàn toàn tương đương rồi rút ra một kết luận quá tay.</w:t>
+        <w:t>Ngay dưới công thức là đoạn từ stage_a2_trainer.py, khoảng dòng 261 đến 286: mã tạo L_graph_group, gọi backward(), kiểm tra gradient, chặn chuẩn gradient nếu cấu hình bật, rồi optimizer.step(). Nếu cô hỏi mô hình thực sự học ở đâu, em mở đoạn này và runner run_nineplus_confirmatory.py, thay vì chỉ trỏ vào sơ đồ trong Word.</w:t>
       </w:r>
     </w:p>
     <w:p>
@@ -412,7 +343,7 @@
         <w:rPr>
           <w:b w:val="0"/>
         </w:rPr>
-        <w:t>Thêm một việc nữa: loss thấp chỉ cho thấy mô hình làm tốt các bài tập tự giám sát ấy. Nó chưa chứng minh vector giúp phát hiện bất thường tốt hơn. Muốn biết điều đó, em dùng các checkpoint đã huấn luyện để trích xuất vector, không cập nhật backbone trong bước đánh giá, rồi kiểm tra bằng đầu dò tuyến tính. Kết quả của phép kiểm tra này là phần tiếp theo.</w:t>
+        <w:t>Bảng bên phải là năm lượt chạy Stage A2 được chuyên đề báo cáo. Em không dùng bảng này để xếp hạng mô hình bằng loss, bởi các mục tiêu và điều kiện chạy chưa đồng nhất hoàn toàn. Seed 999 có giai đoạn khởi động khác kế hoạch; seed 42 dùng lịch cũ và dừng ở epoch 4; các lượt còn lại có vấn đề về mốc xác lập giao thức, hồ sơ thực thi hoặc commit. Khi đối chiếu giao thức đã khóa, không lượt nào trong năm lượt đáp ứng đầy đủ điều kiện chuẩn. Vì vậy kết luận đúng là: có năm hồ sơ và năm số loss quan sát được, nhưng không thể gom chúng thành năm phép lặp chuẩn để tuyên bố chất lượng phát hiện. Muốn trả lời bài toán hạ nguồn, em phải sang bước đánh giá vector V3.</w:t>
       </w:r>
     </w:p>
     <w:p>
@@ -425,7 +356,7 @@
         <w:pStyle w:val="Heading1"/>
       </w:pPr>
       <w:r>
-        <w:t>Slide 7 — Kết quả V3 và cách đọc AP bằng một</w:t>
+        <w:t>Slide 7 — V3: chỉ đầu dò được cập nhật</w:t>
       </w:r>
     </w:p>
     <w:p>
@@ -438,7 +369,7 @@
           <w:b/>
           <w:sz w:val="22"/>
         </w:rPr>
-        <w:t>Mốc thời gian: 8:20–9:45</w:t>
+        <w:t>Mốc thời gian: 6:35–9:20</w:t>
       </w:r>
     </w:p>
     <w:p>
@@ -447,13 +378,7 @@
         <w:rPr>
           <w:b w:val="0"/>
         </w:rPr>
-        <w:t xml:space="preserve">Ở giao thức V3, em so sáu bộ trích xuất cố định: ba Sequence-Only và ba Multi-View, ghép theo cùng ba seed. Với từng bộ, em tạo 35 nghìn vector Train để học đầu dò tuyến tính, rồi đo trên 7 nghìn 500 vector Validation. Trong suốt bước ấy, backbone không được cập nhật. Em cũng đã chạy lại việc trích xuất và huấn luyện đầu dò từ đủ sáu checkpoint trên GPU; các số thu được khớp với Word ở độ chính xác báo cáo. </w:t>
-      </w:r>
-      <w:r>
-        <w:rPr>
-          <w:b/>
-        </w:rPr>
-        <w:t>Đây là đánh giá lại checkpoint, không phải huấn luyện lại Stage A2.</w:t>
+        <w:t>Slide này là trọng tâm của phép so. Em lấy sáu checkpoint đã huấn luyện: Sequence-Only và Multi-View, mỗi nhánh ba seed 42, 7, 999. Với từng checkpoint, mã gọi model.eval() và trích xuất trong torch.no_grad(). Nó tạo ma trận vector Train kích thước 35.000 nhân 128, và Validation 7.500 nhân 128. Hai ma trận này là đầu vào của một lớp tuyến tính nn.Linear(128,1).</w:t>
       </w:r>
     </w:p>
     <w:p>
@@ -462,7 +387,19 @@
         <w:rPr>
           <w:b w:val="0"/>
         </w:rPr>
-        <w:t>Nhìn vào bảng, Sequence-Only đạt AP bằng 1,0000 ở cả ba seed. Multi-View lần lượt khoảng 0,76; 0,63; và 0,59, trung bình là 0,6608. AP phản ánh chất lượng xếp hạng lớp dương; còn ROC-AUC nhìn khả năng phân biệt hai lớp trên nhiều ngưỡng. AP bằng một là kết quả rất cao, nên càng phải nói cho chặt: đây là quan sát trên HDFS Validation theo đúng giao thức V3. Nó không bảo đảm kết quả tương tự trên tập khác, và cũng không tự chứng minh vector đã hiểu mọi tín hiệu an ninh.</w:t>
+        <w:t xml:space="preserve">Chỗ cần chỉ thật rõ trong mã là optimizer = AdamW(probe.parameters()). Bộ tối ưu chỉ nhận tham số của đầu dò, rồi vòng lặp 50 epoch gọi loss.backward() và optimizer.step() cho đầu dò ấy. Tệp kết quả ghi số bước tối ưu của backbone bằng không. Đây là căn cứ để em nói bộ tạo vector </w:t>
+      </w:r>
+      <w:r>
+        <w:rPr>
+          <w:b/>
+        </w:rPr>
+        <w:t>không được cập nhật trong bước V3</w:t>
+      </w:r>
+      <w:r>
+        <w:rPr>
+          <w:b w:val="0"/>
+        </w:rPr>
+        <w:t>; em không viện ra một dòng requires_grad_(False) vì mã không có dòng đó. Điểm đầu dò về mặt toán học là sigmoid của w chuyển vị nhân z cộng b. Sau khi fit trên nhãn Train, mã lấy điểm trên toàn bộ Validation để tính AP và ROC-AUC.</w:t>
       </w:r>
     </w:p>
     <w:p>
@@ -471,7 +408,28 @@
         <w:rPr>
           <w:b w:val="0"/>
         </w:rPr>
-        <w:t>Điều rõ nhất ở bảng này là Multi-View thấp hơn Sequence-Only ở cả ba cặp seed. Kết quả ấy ngược với kỳ vọng ban đầu khi em ghép thêm nhánh đồ thị. Vậy thay vì giải thích cho qua, em đem chính sự chênh lệch này kiểm tra giả thuyết H2.</w:t>
+        <w:t>Giờ ta đọc bảng sáu hàng. Ba seed Sequence đều có AP và ROC-AUC là 1,0000. Ba AP của Multi-View là 0,7604; 0,6309; 0,5911, với ROC-AUC tương ứng 0,9946; 0,8081; 0,7693. AP trung bình Multi-View là 0,6608, độ lệch chuẩn mẫu 0,0885. Cột Var(z) chỉ là độ phân tán trung bình của biểu diễn ẩn; từ một giá trị dương nhỏ không thể tự suy rằng mô hình tránh được sụp đổ biểu diễn theo mọi tiêu chí.</w:t>
+      </w:r>
+    </w:p>
+    <w:p>
+      <w:pPr/>
+      <w:r>
+        <w:rPr>
+          <w:b w:val="0"/>
+        </w:rPr>
+        <w:t xml:space="preserve">Em đã chạy lại bước trích xuất và fit đầu dò từ đủ sáu checkpoint trên GPU; kết quả khớp số trong Word ở độ chính xác báo cáo. Đây là </w:t>
+      </w:r>
+      <w:r>
+        <w:rPr>
+          <w:b/>
+        </w:rPr>
+        <w:t>chạy lại đánh giá</w:t>
+      </w:r>
+      <w:r>
+        <w:rPr>
+          <w:b w:val="0"/>
+        </w:rPr>
+        <w:t>, không phải huấn luyện lại Stage A2 từ đầu. AP bằng một là quan sát đáng chú ý nhưng chỉ trên HDFS Validation theo cách chia này. Nó không phải điểm Test, cũng không chứng minh mô hình hiểu mọi loại tấn công. Điều bảng này cho thấy rõ nhất là, dưới cùng giao thức đầu dò, Multi-View thấp hơn Sequence ở cả ba seed.</w:t>
       </w:r>
     </w:p>
     <w:p>
@@ -484,7 +442,7 @@
         <w:pStyle w:val="Heading1"/>
       </w:pPr>
       <w:r>
-        <w:t>Slide 8 — H2: kiểm tra bằng biên đã đặt trước</w:t>
+        <w:t>Slide 8 — H2: tính từng cặp và kiểm tra ngờ vực</w:t>
       </w:r>
     </w:p>
     <w:p>
@@ -497,7 +455,7 @@
           <w:b/>
           <w:sz w:val="22"/>
         </w:rPr>
-        <w:t>Mốc thời gian: 9:45–11:25</w:t>
+        <w:t>Mốc thời gian: 9:20–11:20</w:t>
       </w:r>
     </w:p>
     <w:p>
@@ -506,7 +464,19 @@
         <w:rPr>
           <w:b w:val="0"/>
         </w:rPr>
-        <w:t>H2 đặt câu hỏi: Multi-View có ít nhất là không thua kém Sequence-Only không? Muốn trả lời thì phải có biên đặt trước, không thể thấy số rồi mới chọn một ngưỡng thuận lợi. Ở đây, biên không thua kém của AP là âm 0,02. Em lấy AP của Multi-View trừ AP của Sequence theo từng seed. Ba độ lệch thu được là âm 0,2396; âm 0,3691; và âm 0,4089. Cả ba đều thấp hơn biên khá xa. Độ lệch trung bình là âm 0,3392; phần cộng trừ đi kèm biểu thị độ lệch chuẩn mẫu qua ba seed, không phải khoảng tin cậy.</w:t>
+        <w:t xml:space="preserve">H2 đầy đủ có thêm các đối chứng khác; phần hoàn tất và so được cùng giao thức ở đây là Multi-View với Sequence-Only. Trước khi nhìn kết quả, chuyên đề dùng biên không thua kém của AP là âm 0,02. Em tính </w:t>
+      </w:r>
+      <w:r>
+        <w:rPr>
+          <w:b/>
+        </w:rPr>
+        <w:t>Delta AP bằng AP Multi-View trừ AP Sequence</w:t>
+      </w:r>
+      <w:r>
+        <w:rPr>
+          <w:b w:val="0"/>
+        </w:rPr>
+        <w:t xml:space="preserve"> cho cùng seed. Nếu Delta nhỏ hơn âm 0,02, cặp đó không đạt biên.</w:t>
       </w:r>
     </w:p>
     <w:p>
@@ -515,7 +485,19 @@
         <w:rPr>
           <w:b w:val="0"/>
         </w:rPr>
-        <w:t>Đến đây có một câu hỏi rất đáng đặt ra: liệu Sequence thắng chỉ vì nó nhìn trực tiếp các khe tham số, còn Multi-View thì không? Em đã làm thêm một phép kiểm tra cho đúng nghi vấn ấy. Em che tham số đầu vào của Sequence ở cả Train lẫn Validation, trích xuất lại vector, rồi học một đầu dò mới. AP của Sequence trong phép kiểm tra này vẫn bằng một ở cả ba seed. Như vậy, trong phạm vi phép thử đã làm, cách giải thích “thắng chỉ vì nhìn thấy tham số” không đứng vững. Phép thử này cũng không nói rằng tham số chẳng có ích; hai câu hỏi đó khác nhau.</w:t>
+        <w:t xml:space="preserve">Ta có thể thay ngay hàng đầu trên bảng: 0,7604 trừ 1,0000 cho khoảng âm 0,2396. Hai seed còn lại lần lượt âm 0,3691 và âm 0,4089. Cả ba thấp hơn biên khá xa; trung bình là âm 0,3392, cộng trừ 0,0885 là độ lệch chuẩn mẫu qua ba seed, không phải khoảng tin cậy. Vì vậy, trong đối chứng này, </w:t>
+      </w:r>
+      <w:r>
+        <w:rPr>
+          <w:b/>
+        </w:rPr>
+        <w:t>H2 không được hỗ trợ</w:t>
+      </w:r>
+      <w:r>
+        <w:rPr>
+          <w:b w:val="0"/>
+        </w:rPr>
+        <w:t>. Với ba seed, em không suy rộng thành mọi dữ liệu và mọi kiến trúc đa góc nhìn.</w:t>
       </w:r>
     </w:p>
     <w:p>
@@ -524,19 +506,7 @@
         <w:rPr>
           <w:b w:val="0"/>
         </w:rPr>
-        <w:t xml:space="preserve">Cho nên, kết luận của em là </w:t>
-      </w:r>
-      <w:r>
-        <w:rPr>
-          <w:b/>
-        </w:rPr>
-        <w:t>H2 không được hỗ trợ trên đối chứng HDFS Validation đã thực hiện</w:t>
-      </w:r>
-      <w:r>
-        <w:rPr>
-          <w:b w:val="0"/>
-        </w:rPr>
-        <w:t>. Em không suy từ ba seed ra rằng mọi mô hình đa góc nhìn đều kém, cũng không coi đây là chứng minh quan hệ nhân quả. Nhưng với biên đã chốt và ba cặp quan sát hiện có, em không thể gọi Multi-View là không thua kém.</w:t>
+        <w:t>Một cách phản biện rất hợp lý là: Sequence thắng chỉ vì nó được nhìn trực tiếp khe tham số, trong khi Multi-View bị thiệt. Em đã thử đúng nghi vấn ấy: che khe tham số của Sequence ở cả Train và Validation, trích xuất lại vector rồi fit đầu dò mới. AP của Sequence vẫn 1,0000 ở cả ba seed. Tệp H2_SEQUENCE_NOPARAM_SENSITIVITY.json ghi riêng từng hàng và chênh lệch. Phép thử này làm yếu cách giải thích “chỉ do khe tham số”, nhưng không chứng minh tham số vô ích hay tìm ra nguyên nhân duy nhất khiến Multi-View kém. Đó là việc phải làm tiếp.</w:t>
       </w:r>
     </w:p>
     <w:p>
@@ -549,7 +519,7 @@
         <w:pStyle w:val="Heading1"/>
       </w:pPr>
       <w:r>
-        <w:t>Slide 9 — H1: quan sát được phản ứng, chưa chứng minh được ngữ nghĩa</w:t>
+        <w:t>Slide 9 — H1: phản ứng của vector và giới hạn cấp đo</w:t>
       </w:r>
     </w:p>
     <w:p>
@@ -562,7 +532,7 @@
           <w:b/>
           <w:sz w:val="22"/>
         </w:rPr>
-        <w:t>Mốc thời gian: 11:25–13:20</w:t>
+        <w:t>Mốc thời gian: 11:20–13:35</w:t>
       </w:r>
     </w:p>
     <w:p>
@@ -571,7 +541,7 @@
         <w:rPr>
           <w:b w:val="0"/>
         </w:rPr>
-        <w:t>Sang H1, câu hỏi lại khác: thông tin tham số động có còn trong vector với đúng ý nghĩa an ninh hay không? Chỗ khó nằm ở cấp độ đo. Nhãn của tham số ở cấp token hoặc khe tham số, còn vector em đem đánh giá là một vector 128 chiều gộp cho cả phiên. Nếu lấy điểm phát hiện bất thường cấp phiên để khẳng định H1, thực ra em đã đổi câu hỏi mà không nói ra.</w:t>
+        <w:t>H1 hỏi thông tin của tham số động có được giữ với đúng ý nghĩa an ninh hay không. Nhãn cần kiểm tra nằm ở cấp token hoặc khe tham số, trong khi vector V3 đang đo là một vector 128 chiều gộp cho cả phiên. Nếu lấy AP cấp phiên để tuyên bố H1 đã được chứng minh thì mình đã lẫn cấp độ đo.</w:t>
       </w:r>
     </w:p>
     <w:p>
@@ -580,19 +550,7 @@
         <w:rPr>
           <w:b w:val="0"/>
         </w:rPr>
-        <w:t xml:space="preserve">Vì chưa có phép đo trực tiếp ở cấp tham số, em làm một phép thử gián tiếp. Em giữ nguyên mô hình Sequence, che các khe tham số ở đầu vào, rồi so vector trước và sau khi che. Cosine nằm từ 0,8201 đến 0,9581; khoảng cách Euclid cũng khác không. Nghĩa là vector có phản ứng với thao tác che. Nhưng AP phát hiện bất thường vẫn bằng một. </w:t>
-      </w:r>
-      <w:r>
-        <w:rPr>
-          <w:b/>
-        </w:rPr>
-        <w:t>Điều phép thử cho thấy là vector có thay đổi; điều nó chưa cho thấy là mô hình đã giữ đúng ngữ nghĩa của tham số.</w:t>
-      </w:r>
-      <w:r>
-        <w:rPr>
-          <w:b w:val="0"/>
-        </w:rPr>
-        <w:t xml:space="preserve"> Cũng không thể đảo lại mà bảo tham số vô ích, vì bài toán HDFS ở cấp phiên có thể còn những tín hiệu khác để giải.</w:t>
+        <w:t>Phép thử hiện có mang tính gián tiếp. Em giữ nguyên từng checkpoint Sequence, tạo một vector khi có tham số và một vector khi che các khe tham số, rồi đo cosine và khoảng cách Euclid L2. Cosine gần một nghĩa là hai vector gần cùng hướng hơn; L2 càng lớn thì chúng càng xa nhau. Ba giá trị cosine trung bình là 0,9581; 0,8201; 0,9546. Các khoảng cách L2 đều khác không. Như vậy vector có phản ứng với thao tác che. Nhưng AP cấp phiên trước và sau che đều 1,0000 ở cả ba seed. Ta có thể nói vector đổi mà phép đo AP này không đổi; không thể nói mô hình đã giữ đúng ngữ nghĩa từng khe, cũng không thể nói tham số hoàn toàn vô ích.</w:t>
       </w:r>
     </w:p>
     <w:p>
@@ -601,7 +559,7 @@
         <w:rPr>
           <w:b w:val="0"/>
         </w:rPr>
-        <w:t>Em cũng đưa lên slide lượt chạy lại thủ công của Sequence seed 42 để người đọc thấy thêm một lát cắt của quá trình. Lượt này chạy sáu epoch, checkpoint tốt nhất ở epoch ba; loss Validation tốt nhất là 0,009218 và bộ nhớ GPU đỉnh khoảng 170,45 MB. Có hai số AP dễ bị nhìn thành một phép so: 0,899385 và 1,0000. Thực ra chúng thuộc hai giao thức khác nhau. Số thứ nhất đến từ đầu dò nội bộ chia Validation theo tỷ lệ 80/20; số thứ hai là đầu dò V3 học trên Train rồi đánh giá trên Validation. Em giữ cả hai số, nhưng không coi chênh lệch giữa chúng là mức cải thiện của cùng một thí nghiệm.</w:t>
+        <w:t>Ở góc dưới slide em để một lượt tái lập thủ công seed 42: sáu epoch, tốt nhất ở epoch ba, loss Validation 0,009218 và VRAM đỉnh khoảng 170,45 MB. Số AP nội bộ 0,899385 và AP V3 1,0000 dễ bị so sai. Hai run ID của checkpoint khác nhau nhưng tệp trọng số có cùng SHA-256; điều làm hai AP không cùng thước so là giao thức đầu dò. Đầu dò nội bộ chia Validation 80/20 để học và đo, còn V3 học trên Train và đo trên toàn bộ Validation. Em không gọi chênh lệch đó là mức cải thiện. Để trả lời H1 đúng nghĩa, cần một phép đo với biểu diễn và nhãn ở cùng cấp token hoặc khe.</w:t>
       </w:r>
     </w:p>
     <w:p>
@@ -614,7 +572,7 @@
         <w:pStyle w:val="Heading1"/>
       </w:pPr>
       <w:r>
-        <w:t>Slide 10 — Đóng góp, kết quả âm tính và việc cần làm tiếp</w:t>
+        <w:t>Slide 10 — Kết luận gắn với tệp chứng cứ</w:t>
       </w:r>
     </w:p>
     <w:p>
@@ -627,7 +585,7 @@
           <w:b/>
           <w:sz w:val="22"/>
         </w:rPr>
-        <w:t>Mốc thời gian: 13:20–15:00</w:t>
+        <w:t>Mốc thời gian: 13:35–15:00</w:t>
       </w:r>
     </w:p>
     <w:p>
@@ -636,7 +594,7 @@
         <w:rPr>
           <w:b w:val="0"/>
         </w:rPr>
-        <w:t>Đến đây em xin chốt lại chuyên đề đóng góp gì và bằng chứng hiện có đi được đến đâu. Phần thứ nhất là Hợp đồng Biểu diễn: đặt ra những tiêu chí cụ thể để kiểm tra một vector log. Phần thứ hai là thiết kế kết hợp chuỗi với đồ thị theo thời gian. Em dùng các khối như Transformer và VICReg trong thiết kế, chứ không nhận đó là thuật toán do mình phát minh. Phần thứ ba là quy trình thực nghiệm có thể đối soát: từ cách chia dữ liệu, đánh giá đầu dò mà không cập nhật backbone, đến việc ghi lại cả sai lệch thủ tục lẫn kết quả không thuận với giả thuyết.</w:t>
+        <w:t>Slide cuối là bản đồ chứng cứ. Dữ liệu và phép chia nằm ở hai manifest HDFS; loss huấn luyện ở stage_a2_trainer.py; đường trích xuất và gióng hàng ở multi_view.py. Trong evaluate_nineplus_v3.py, trích xuất dùng eval() và no_grad(), còn bộ tối ưu chỉ nhận probe.parameters(). Sáu hàng kết quả nằm ở V3_SIX_BACKBONE_EVALUATION_SUMMARY.json.</w:t>
       </w:r>
     </w:p>
     <w:p>
@@ -645,7 +603,7 @@
         <w:rPr>
           <w:b w:val="0"/>
         </w:rPr>
-        <w:t>Nếu tách từng giả thuyết ra thì bức tranh hiện nay khá rõ. H1 chưa được kiểm tra trực tiếp ở đúng cấp tham số. H2 không được hỗ trợ trên HDFS Validation. H3 đến H5 chưa có thực nghiệm xác nhận. Với ER1, em mới có quan sát về bộ nhớ, chưa có số đo thông lượng và độ trễ. Graph-Only xác nhận mới chưa được huấn luyện theo V3, và tập Test vẫn niêm phong.</w:t>
+        <w:t>Em nhận ba phần đóng góp: đặc tả Hợp đồng Biểu diễn, tích hợp kiến trúc chuỗi–đồ thị, và hiện thực cùng kiểm toán. Em không nhận Transformer, Temporal GNN hay VICReg là thuật toán mình phát minh. Bằng chứng hiện có không hỗ trợ H2 trên HDFS Validation; H1 chưa đo trực tiếp ở cấp tham số. H3 đến H5, Graph-Only V3, độ trễ toàn trình và Test còn thiếu.</w:t>
       </w:r>
     </w:p>
     <w:p>
@@ -654,7 +612,7 @@
         <w:rPr>
           <w:b w:val="0"/>
         </w:rPr>
-        <w:t>Theo em, kết quả âm tính của H2 không phải điều cần giấu. Nó chỉ đúng chỗ giả định thiết kế chưa được dữ liệu ủng hộ: thêm góc nhìn đồ thị vào đã không mang lại lợi ích trong phép thử này. Việc tiếp theo là đo H1 ở cấp token, tìm xem vì sao Multi-View giảm hiệu năng, thử trên dữ liệu có quan hệ phong phú hơn, rồi mới mở Test theo giao thức đã khóa trước. Em xin dừng ở những kết luận mà số liệu hiện có thực sự cho phép. Em cảm ơn cô và các thầy cô đã lắng nghe.</w:t>
+        <w:t>Kết quả hiện có không cho phép gọi mô hình đa góc nhìn tốt hơn. Em xin dừng ở điều đã đo được và sẵn sàng mở mã, manifest, bảng kết quả để trả lời câu hỏi của cô.</w:t>
       </w:r>
     </w:p>
     <w:sectPr>

</xml_diff>

<commit_message>
docs(defense): explain AP at first use in slides and speech
</commit_message>
<xml_diff>
--- a/bao-ve/LOI-THUYET-TRINH-15-PHUT.docx
+++ b/bao-ve/LOI-THUYET-TRINH-15-PHUT.docx
@@ -248,7 +248,7 @@
         <w:rPr>
           <w:b w:val="0"/>
         </w:rPr>
-        <w:t xml:space="preserve">Trước khi nói đến điểm AP, em xin chỉ nguồn của các con số. Ngữ liệu HDFS gốc có 11.175.629 dòng log, gom thành 575.061 phiên khối có nhãn. Đây là quy mô </w:t>
+        <w:t xml:space="preserve">Trước khi xem điểm đánh giá, em xin chỉ nguồn của các con số. Ngữ liệu HDFS gốc có 11.175.629 dòng log, gom thành 575.061 phiên khối có nhãn. Đây là quy mô </w:t>
       </w:r>
       <w:r>
         <w:rPr>
@@ -325,7 +325,7 @@
         <w:rPr>
           <w:b w:val="0"/>
         </w:rPr>
-        <w:t>. Ba số hạng lần lượt là sai số dự đoán quan hệ bị che, tái tạo thuộc tính nút bị che và dự đoán khoảng thời gian. Trước khi cộng, mã chia tổng sai số từng loại cho số mục tiêu hợp lệ của loại ấy. Thành ra hệ số 0,1 là trọng số trong mục tiêu tối ưu; không thể đọc nó thành “thời gian chỉ đóng góp 10% vào AP”.</w:t>
+        <w:t>. Ba số hạng lần lượt là sai số dự đoán quan hệ bị che, tái tạo thuộc tính nút bị che và dự đoán khoảng thời gian. Trước khi cộng, mã chia tổng sai số từng loại cho số mục tiêu hợp lệ của loại ấy. Thành ra hệ số 0,1 là trọng số trong mục tiêu tối ưu; không thể đọc nó thành “thời gian chỉ đóng góp 10% vào kết quả phát hiện”.</w:t>
       </w:r>
     </w:p>
     <w:p>
@@ -399,7 +399,19 @@
         <w:rPr>
           <w:b w:val="0"/>
         </w:rPr>
-        <w:t>; em không viện ra một dòng requires_grad_(False) vì mã không có dòng đó. Điểm đầu dò về mặt toán học là sigmoid của w chuyển vị nhân z cộng b. Sau khi fit trên nhãn Train, mã lấy điểm trên toàn bộ Validation để tính AP và ROC-AUC.</w:t>
+        <w:t xml:space="preserve">; em không viện ra một dòng requires_grad_(False) vì mã không có dòng đó. Điểm đầu dò là sigmoid của w chuyển vị nhân z cộng b. Sau khi học trên Train, mã chấm điểm toàn bộ Validation. </w:t>
+      </w:r>
+      <w:r>
+        <w:rPr>
+          <w:b/>
+        </w:rPr>
+        <w:t>AP là Average Precision, tức độ chính xác trung bình</w:t>
+      </w:r>
+      <w:r>
+        <w:rPr>
+          <w:b w:val="0"/>
+        </w:rPr>
+        <w:t>: khi xếp các phiên theo điểm, các phiên thật sự bất thường càng ở phía đầu danh sách thì AP càng cao. Nó không phải tỷ lệ dự đoán đúng của toàn bộ phiên. Còn ROC-AUC là diện tích dưới đường ROC, đo khả năng phân biệt hai lớp khi thay đổi ngưỡng.</w:t>
       </w:r>
     </w:p>
     <w:p>

</xml_diff>